<commit_message>
lazy evaluation term added
</commit_message>
<xml_diff>
--- a/Spark_common_Keywords.docx
+++ b/Spark_common_Keywords.docx
@@ -59,21 +59,7 @@
         <w:rPr>
           <w:rFonts w:ascii="Times New Roman" w:hAnsi="Times New Roman" w:cs="Times New Roman"/>
         </w:rPr>
-        <w:t xml:space="preserve">Q1. What is the difference between map, </w:t>
-      </w:r>
-      <w:proofErr w:type="spellStart"/>
-      <w:r>
-        <w:rPr>
-          <w:rFonts w:ascii="Times New Roman" w:hAnsi="Times New Roman" w:cs="Times New Roman"/>
-        </w:rPr>
-        <w:t>flatmap</w:t>
-      </w:r>
-      <w:proofErr w:type="spellEnd"/>
-      <w:r>
-        <w:rPr>
-          <w:rFonts w:ascii="Times New Roman" w:hAnsi="Times New Roman" w:cs="Times New Roman"/>
-        </w:rPr>
-        <w:t>.</w:t>
+        <w:t>Q1. What is the difference between map, flatmap.</w:t>
       </w:r>
     </w:p>
     <w:p>
@@ -90,21 +76,7 @@
         <w:rPr>
           <w:rFonts w:ascii="Times New Roman" w:hAnsi="Times New Roman" w:cs="Times New Roman"/>
         </w:rPr>
-        <w:t xml:space="preserve">Q2. What is the difference between RDD and </w:t>
-      </w:r>
-      <w:proofErr w:type="spellStart"/>
-      <w:r>
-        <w:rPr>
-          <w:rFonts w:ascii="Times New Roman" w:hAnsi="Times New Roman" w:cs="Times New Roman"/>
-        </w:rPr>
-        <w:t>DataFrame</w:t>
-      </w:r>
-      <w:proofErr w:type="spellEnd"/>
-      <w:r>
-        <w:rPr>
-          <w:rFonts w:ascii="Times New Roman" w:hAnsi="Times New Roman" w:cs="Times New Roman"/>
-        </w:rPr>
-        <w:t xml:space="preserve">. </w:t>
+        <w:t xml:space="preserve">Q2. What is the difference between RDD and DataFrame. </w:t>
       </w:r>
     </w:p>
     <w:p>
@@ -245,50 +217,58 @@
     </w:p>
     <w:p>
       <w:pPr>
-        <w:rPr>
-          <w:rFonts w:ascii="Times New Roman" w:hAnsi="Times New Roman" w:cs="Times New Roman"/>
-        </w:rPr>
-      </w:pPr>
-    </w:p>
-    <w:p>
-      <w:pPr>
-        <w:rPr>
-          <w:rFonts w:ascii="Times New Roman" w:hAnsi="Times New Roman" w:cs="Times New Roman"/>
-        </w:rPr>
-      </w:pPr>
-    </w:p>
-    <w:p>
-      <w:pPr>
-        <w:rPr>
-          <w:rFonts w:ascii="Times New Roman" w:hAnsi="Times New Roman" w:cs="Times New Roman"/>
-        </w:rPr>
-      </w:pPr>
-      <w:r>
-        <w:rPr>
-          <w:rFonts w:ascii="Times New Roman" w:hAnsi="Times New Roman" w:cs="Times New Roman"/>
-        </w:rPr>
-        <w:t xml:space="preserve">Q1. What is the difference between map, </w:t>
-      </w:r>
-      <w:proofErr w:type="spellStart"/>
-      <w:r>
-        <w:rPr>
-          <w:rFonts w:ascii="Times New Roman" w:hAnsi="Times New Roman" w:cs="Times New Roman"/>
-        </w:rPr>
-        <w:t>flatmap</w:t>
-      </w:r>
-      <w:proofErr w:type="spellEnd"/>
-      <w:r>
-        <w:rPr>
-          <w:rFonts w:ascii="Times New Roman" w:hAnsi="Times New Roman" w:cs="Times New Roman"/>
-        </w:rPr>
-        <w:t>.</w:t>
+        <w:numPr>
+          <w:ilvl w:val="1"/>
+          <w:numId w:val="1"/>
+        </w:numPr>
+        <w:rPr>
+          <w:rFonts w:ascii="Times New Roman" w:hAnsi="Times New Roman" w:cs="Times New Roman"/>
+        </w:rPr>
+      </w:pPr>
+      <w:r>
+        <w:rPr>
+          <w:rFonts w:ascii="Times New Roman" w:hAnsi="Times New Roman" w:cs="Times New Roman"/>
+        </w:rPr>
+        <w:t>Laz</w:t>
+      </w:r>
+      <w:r>
+        <w:rPr>
+          <w:rFonts w:ascii="Times New Roman" w:hAnsi="Times New Roman" w:cs="Times New Roman"/>
+        </w:rPr>
+        <w:t>y Evaluation</w:t>
+      </w:r>
+    </w:p>
+    <w:p>
+      <w:pPr>
+        <w:rPr>
+          <w:rFonts w:ascii="Times New Roman" w:hAnsi="Times New Roman" w:cs="Times New Roman"/>
+        </w:rPr>
+      </w:pPr>
+    </w:p>
+    <w:p>
+      <w:pPr>
+        <w:rPr>
+          <w:rFonts w:ascii="Times New Roman" w:hAnsi="Times New Roman" w:cs="Times New Roman"/>
+        </w:rPr>
+      </w:pPr>
+    </w:p>
+    <w:p>
+      <w:pPr>
+        <w:rPr>
+          <w:rFonts w:ascii="Times New Roman" w:hAnsi="Times New Roman" w:cs="Times New Roman"/>
+        </w:rPr>
+      </w:pPr>
+      <w:r>
+        <w:rPr>
+          <w:rFonts w:ascii="Times New Roman" w:hAnsi="Times New Roman" w:cs="Times New Roman"/>
+        </w:rPr>
+        <w:t>Q1. What is the difference between map, flatmap.</w:t>
       </w:r>
     </w:p>
     <w:p>
       <w:pPr>
         <w:pStyle w:val="isselectedend"/>
       </w:pPr>
-      <w:proofErr w:type="gramStart"/>
       <w:r>
         <w:rPr>
           <w:rStyle w:val="HTMLCode"/>
@@ -296,9 +276,11 @@
           <w:sz w:val="24"/>
           <w:szCs w:val="24"/>
         </w:rPr>
-        <w:t>map(</w:t>
-      </w:r>
-      <w:proofErr w:type="gramEnd"/>
+        <w:t>map()</w:t>
+      </w:r>
+      <w:r>
+        <w:t xml:space="preserve"> and </w:t>
+      </w:r>
       <w:r>
         <w:rPr>
           <w:rStyle w:val="HTMLCode"/>
@@ -306,13 +288,11 @@
           <w:sz w:val="24"/>
           <w:szCs w:val="24"/>
         </w:rPr>
-        <w:t>)</w:t>
-      </w:r>
-      <w:r>
-        <w:t xml:space="preserve"> and </w:t>
-      </w:r>
-      <w:proofErr w:type="spellStart"/>
-      <w:proofErr w:type="gramStart"/>
+        <w:t>flatMap()</w:t>
+      </w:r>
+      <w:r>
+        <w:t xml:space="preserve"> are both transformations used with RDDs in PySpark. The main difference is how they handle the output. </w:t>
+      </w:r>
       <w:r>
         <w:rPr>
           <w:rStyle w:val="HTMLCode"/>
@@ -320,9 +300,29 @@
           <w:sz w:val="24"/>
           <w:szCs w:val="24"/>
         </w:rPr>
-        <w:t>flatMap</w:t>
-      </w:r>
-      <w:proofErr w:type="spellEnd"/>
+        <w:t>map()</w:t>
+      </w:r>
+      <w:r>
+        <w:t xml:space="preserve"> takes each element and produces exactly one output for it. For example, if an RDD contains </w:t>
+      </w:r>
+      <w:r>
+        <w:rPr>
+          <w:rStyle w:val="text-token-text-primary"/>
+        </w:rPr>
+        <w:t>[1, 2, 3]</w:t>
+      </w:r>
+      <w:r>
+        <w:t xml:space="preserve"> and we multiply each value by 2, the result will be </w:t>
+      </w:r>
+      <w:r>
+        <w:rPr>
+          <w:rStyle w:val="text-token-text-primary"/>
+        </w:rPr>
+        <w:t>[2, 4, 6]</w:t>
+      </w:r>
+      <w:r>
+        <w:t xml:space="preserve">. In simple terms, </w:t>
+      </w:r>
       <w:r>
         <w:rPr>
           <w:rStyle w:val="HTMLCode"/>
@@ -330,9 +330,27 @@
           <w:sz w:val="24"/>
           <w:szCs w:val="24"/>
         </w:rPr>
-        <w:t>(</w:t>
-      </w:r>
-      <w:proofErr w:type="gramEnd"/>
+        <w:t>map()</w:t>
+      </w:r>
+      <w:r>
+        <w:t xml:space="preserve"> follows a </w:t>
+      </w:r>
+      <w:r>
+        <w:rPr>
+          <w:rStyle w:val="Strong"/>
+          <w:b w:val="0"/>
+          <w:bCs w:val="0"/>
+        </w:rPr>
+        <w:t>one input to one output</w:t>
+      </w:r>
+      <w:r>
+        <w:t xml:space="preserve"> approach.</w:t>
+      </w:r>
+    </w:p>
+    <w:p>
+      <w:pPr>
+        <w:pStyle w:val="isselectedend"/>
+      </w:pPr>
       <w:r>
         <w:rPr>
           <w:rStyle w:val="HTMLCode"/>
@@ -340,20 +358,11 @@
           <w:sz w:val="24"/>
           <w:szCs w:val="24"/>
         </w:rPr>
-        <w:t>)</w:t>
-      </w:r>
-      <w:r>
-        <w:t xml:space="preserve"> are both transformations used with RDDs in </w:t>
-      </w:r>
-      <w:proofErr w:type="spellStart"/>
-      <w:r>
-        <w:t>PySpark</w:t>
-      </w:r>
-      <w:proofErr w:type="spellEnd"/>
-      <w:r>
-        <w:t xml:space="preserve">. The main difference is how they handle the output. </w:t>
-      </w:r>
-      <w:proofErr w:type="gramStart"/>
+        <w:t>flatMap()</w:t>
+      </w:r>
+      <w:r>
+        <w:t xml:space="preserve"> can produce multiple outputs from a single input and then combines all those outputs into one RDD. For example, if an RDD contains </w:t>
+      </w:r>
       <w:r>
         <w:rPr>
           <w:rStyle w:val="HTMLCode"/>
@@ -361,9 +370,11 @@
           <w:sz w:val="24"/>
           <w:szCs w:val="24"/>
         </w:rPr>
-        <w:t>map(</w:t>
-      </w:r>
-      <w:proofErr w:type="gramEnd"/>
+        <w:t>"Hello World"</w:t>
+      </w:r>
+      <w:r>
+        <w:t xml:space="preserve"> and </w:t>
+      </w:r>
       <w:r>
         <w:rPr>
           <w:rStyle w:val="HTMLCode"/>
@@ -371,30 +382,11 @@
           <w:sz w:val="24"/>
           <w:szCs w:val="24"/>
         </w:rPr>
-        <w:t>)</w:t>
-      </w:r>
-      <w:r>
-        <w:t xml:space="preserve"> takes each element and produces exactly one output for it. For example, if an RDD contains </w:t>
-      </w:r>
-      <w:r>
-        <w:rPr>
-          <w:rStyle w:val="text-token-text-primary"/>
-        </w:rPr>
-        <w:t>[1, 2, 3]</w:t>
-      </w:r>
-      <w:r>
-        <w:t xml:space="preserve"> and we multiply each value by 2, the result will be </w:t>
-      </w:r>
-      <w:r>
-        <w:rPr>
-          <w:rStyle w:val="text-token-text-primary"/>
-        </w:rPr>
-        <w:t>[2, 4, 6]</w:t>
-      </w:r>
-      <w:r>
-        <w:t xml:space="preserve">. In simple terms, </w:t>
-      </w:r>
-      <w:proofErr w:type="gramStart"/>
+        <w:t>"Hello Spark"</w:t>
+      </w:r>
+      <w:r>
+        <w:t xml:space="preserve">, </w:t>
+      </w:r>
       <w:r>
         <w:rPr>
           <w:rStyle w:val="HTMLCode"/>
@@ -402,9 +394,20 @@
           <w:sz w:val="24"/>
           <w:szCs w:val="24"/>
         </w:rPr>
-        <w:t>map(</w:t>
-      </w:r>
-      <w:proofErr w:type="gramEnd"/>
+        <w:t>flatMap()</w:t>
+      </w:r>
+      <w:r>
+        <w:t xml:space="preserve"> can split each sentence into individual words and produce </w:t>
+      </w:r>
+      <w:r>
+        <w:rPr>
+          <w:rStyle w:val="text-token-text-primary"/>
+        </w:rPr>
+        <w:t>["Hello", "World", "Hello", "Spark"]</w:t>
+      </w:r>
+      <w:r>
+        <w:t xml:space="preserve">. In simple terms, </w:t>
+      </w:r>
       <w:r>
         <w:rPr>
           <w:rStyle w:val="HTMLCode"/>
@@ -412,18 +415,18 @@
           <w:sz w:val="24"/>
           <w:szCs w:val="24"/>
         </w:rPr>
-        <w:t>)</w:t>
-      </w:r>
-      <w:r>
-        <w:t xml:space="preserve"> follows a </w:t>
-      </w:r>
-      <w:r>
-        <w:rPr>
-          <w:rStyle w:val="Strong"/>
-          <w:b w:val="0"/>
-          <w:bCs w:val="0"/>
-        </w:rPr>
-        <w:t>one input to one output</w:t>
+        <w:t>flatMap()</w:t>
+      </w:r>
+      <w:r>
+        <w:t xml:space="preserve"> can follow a </w:t>
+      </w:r>
+      <w:r>
+        <w:rPr>
+          <w:rStyle w:val="Strong"/>
+          <w:b w:val="0"/>
+          <w:bCs w:val="0"/>
+        </w:rPr>
+        <w:t>one input to multiple outputs</w:t>
       </w:r>
       <w:r>
         <w:t xml:space="preserve"> approach.</w:t>
@@ -431,30 +434,105 @@
     </w:p>
     <w:p>
       <w:pPr>
-        <w:pStyle w:val="isselectedend"/>
-      </w:pPr>
-      <w:proofErr w:type="spellStart"/>
-      <w:proofErr w:type="gramStart"/>
-      <w:r>
-        <w:rPr>
-          <w:rStyle w:val="HTMLCode"/>
+        <w:rPr>
+          <w:rFonts w:ascii="Times New Roman" w:hAnsi="Times New Roman" w:cs="Times New Roman"/>
+        </w:rPr>
+      </w:pPr>
+      <w:r>
+        <w:rPr>
+          <w:rFonts w:ascii="Times New Roman" w:hAnsi="Times New Roman" w:cs="Times New Roman"/>
+        </w:rPr>
+        <w:t xml:space="preserve">Q2. What is the difference between RDD and DataFrame. </w:t>
+      </w:r>
+    </w:p>
+    <w:p>
+      <w:pPr>
+        <w:rPr>
           <w:rFonts w:ascii="Times New Roman" w:hAnsi="Times New Roman" w:cs="Times New Roman"/>
           <w:sz w:val="24"/>
           <w:szCs w:val="24"/>
         </w:rPr>
-        <w:t>flatMap</w:t>
-      </w:r>
-      <w:proofErr w:type="spellEnd"/>
-      <w:r>
-        <w:rPr>
-          <w:rStyle w:val="HTMLCode"/>
+      </w:pPr>
+      <w:r>
+        <w:rPr>
           <w:rFonts w:ascii="Times New Roman" w:hAnsi="Times New Roman" w:cs="Times New Roman"/>
           <w:sz w:val="24"/>
           <w:szCs w:val="24"/>
         </w:rPr>
-        <w:t>(</w:t>
-      </w:r>
-      <w:proofErr w:type="gramEnd"/>
+        <w:t>An RDD, or Resilient Distributed Dataset, is a basic Spark data structure that represents a distributed collection of objects. Spark can divide the data into partitions and process those partitions in parallel. RDDs give developers more low-level control over how the data is processed, but they do not provide the same structured format as a DataFrame.</w:t>
+      </w:r>
+    </w:p>
+    <w:p>
+      <w:pPr>
+        <w:pStyle w:val="isselectedend"/>
+        <w:rPr>
+          <w:rStyle w:val="Strong"/>
+          <w:b w:val="0"/>
+          <w:bCs w:val="0"/>
+        </w:rPr>
+      </w:pPr>
+      <w:r>
+        <w:t xml:space="preserve">A DataFrame is a higher-level Spark data structure that organizes data into rows and columns, similar to a table in a database. It also has a schema that tells Spark the names and data types of the columns. DataFrames are generally easier to work with for structured data and allow Spark to optimize many operations automatically. In simple terms, </w:t>
+      </w:r>
+      <w:r>
+        <w:rPr>
+          <w:rStyle w:val="Strong"/>
+          <w:b w:val="0"/>
+          <w:bCs w:val="0"/>
+        </w:rPr>
+        <w:t>an RDD is a distributed collection of objects, while a DataFrame is distributed data organized into rows and columns with a defined structure.</w:t>
+      </w:r>
+    </w:p>
+    <w:p>
+      <w:pPr>
+        <w:pStyle w:val="isselectedend"/>
+        <w:rPr>
+          <w:rStyle w:val="Strong"/>
+          <w:b w:val="0"/>
+          <w:bCs w:val="0"/>
+        </w:rPr>
+      </w:pPr>
+    </w:p>
+    <w:p>
+      <w:pPr>
+        <w:pStyle w:val="isselectedend"/>
+        <w:rPr>
+          <w:rStyle w:val="Strong"/>
+          <w:b w:val="0"/>
+          <w:bCs w:val="0"/>
+        </w:rPr>
+      </w:pPr>
+    </w:p>
+    <w:p>
+      <w:pPr>
+        <w:pStyle w:val="isselectedend"/>
+      </w:pPr>
+    </w:p>
+    <w:p>
+      <w:pPr>
+        <w:rPr>
+          <w:rFonts w:ascii="Times New Roman" w:hAnsi="Times New Roman" w:cs="Times New Roman"/>
+        </w:rPr>
+      </w:pPr>
+      <w:r>
+        <w:rPr>
+          <w:rFonts w:ascii="Times New Roman" w:hAnsi="Times New Roman" w:cs="Times New Roman"/>
+        </w:rPr>
+        <w:t xml:space="preserve">Q3. How to control the parallelism in spark. </w:t>
+      </w:r>
+    </w:p>
+    <w:p>
+      <w:pPr>
+        <w:pStyle w:val="isselectedend"/>
+        <w:rPr>
+          <w:rStyle w:val="Strong"/>
+          <w:b w:val="0"/>
+          <w:bCs w:val="0"/>
+        </w:rPr>
+      </w:pPr>
+      <w:r>
+        <w:t xml:space="preserve">Parallelism in Spark refers to how much work Spark can perform at the same time. One of the main ways to control parallelism is by controlling the number of partitions. A partition is basically a chunk of data that Spark can process separately. For example, when creating an RDD, we can specify the number of partitions using </w:t>
+      </w:r>
       <w:r>
         <w:rPr>
           <w:rStyle w:val="HTMLCode"/>
@@ -462,10 +540,10 @@
           <w:sz w:val="24"/>
           <w:szCs w:val="24"/>
         </w:rPr>
-        <w:t>)</w:t>
-      </w:r>
-      <w:r>
-        <w:t xml:space="preserve"> can produce multiple outputs from a single input and then combines all those outputs into one RDD. For example, if an RDD contains </w:t>
+        <w:t>parallelize(data, 4)</w:t>
+      </w:r>
+      <w:r>
+        <w:t xml:space="preserve">. We can also change the number of partitions using functions such as </w:t>
       </w:r>
       <w:r>
         <w:rPr>
@@ -474,7 +552,7 @@
           <w:sz w:val="24"/>
           <w:szCs w:val="24"/>
         </w:rPr>
-        <w:t>"Hello World"</w:t>
+        <w:t>repartition()</w:t>
       </w:r>
       <w:r>
         <w:t xml:space="preserve"> and </w:t>
@@ -486,139 +564,356 @@
           <w:sz w:val="24"/>
           <w:szCs w:val="24"/>
         </w:rPr>
-        <w:t>"Hello Spark"</w:t>
-      </w:r>
-      <w:r>
-        <w:t xml:space="preserve">, </w:t>
-      </w:r>
-      <w:proofErr w:type="spellStart"/>
-      <w:proofErr w:type="gramStart"/>
-      <w:r>
-        <w:rPr>
-          <w:rStyle w:val="HTMLCode"/>
-          <w:rFonts w:ascii="Times New Roman" w:hAnsi="Times New Roman" w:cs="Times New Roman"/>
+        <w:t>coalesce()</w:t>
+      </w:r>
+      <w:r>
+        <w:t xml:space="preserve">. In simple terms, </w:t>
+      </w:r>
+      <w:r>
+        <w:rPr>
+          <w:rStyle w:val="Strong"/>
+          <w:b w:val="0"/>
+          <w:bCs w:val="0"/>
+        </w:rPr>
+        <w:t>more partitions can allow more work to happen in parallel, depending on the available resources.</w:t>
+      </w:r>
+    </w:p>
+    <w:p>
+      <w:pPr>
+        <w:pStyle w:val="isselectedend"/>
+      </w:pPr>
+      <w:r>
+        <w:t xml:space="preserve"> </w:t>
+      </w:r>
+    </w:p>
+    <w:p>
+      <w:pPr>
+        <w:rPr>
+          <w:rFonts w:ascii="Times New Roman" w:hAnsi="Times New Roman" w:cs="Times New Roman"/>
+        </w:rPr>
+      </w:pPr>
+    </w:p>
+    <w:p>
+      <w:pPr>
+        <w:rPr>
+          <w:rFonts w:ascii="Times New Roman" w:hAnsi="Times New Roman" w:cs="Times New Roman"/>
+        </w:rPr>
+      </w:pPr>
+      <w:r>
+        <w:rPr>
+          <w:rFonts w:ascii="Times New Roman" w:hAnsi="Times New Roman" w:cs="Times New Roman"/>
+        </w:rPr>
+        <w:t>Q4. Please explain followings</w:t>
+      </w:r>
+    </w:p>
+    <w:p>
+      <w:pPr>
+        <w:rPr>
+          <w:rFonts w:ascii="Times New Roman" w:hAnsi="Times New Roman" w:cs="Times New Roman"/>
+        </w:rPr>
+      </w:pPr>
+    </w:p>
+    <w:p>
+      <w:pPr>
+        <w:rPr>
+          <w:rFonts w:ascii="Times New Roman" w:hAnsi="Times New Roman" w:cs="Times New Roman"/>
+        </w:rPr>
+      </w:pPr>
+      <w:r>
+        <w:rPr>
+          <w:rFonts w:ascii="Times New Roman" w:hAnsi="Times New Roman" w:cs="Times New Roman"/>
+        </w:rPr>
+        <w:t>Spark Driver</w:t>
+      </w:r>
+    </w:p>
+    <w:p>
+      <w:pPr>
+        <w:rPr>
+          <w:rFonts w:ascii="Times New Roman" w:hAnsi="Times New Roman" w:cs="Times New Roman"/>
+        </w:rPr>
+      </w:pPr>
+    </w:p>
+    <w:p>
+      <w:pPr>
+        <w:rPr>
+          <w:rStyle w:val="Strong"/>
+          <w:rFonts w:ascii="Times New Roman" w:hAnsi="Times New Roman" w:cs="Times New Roman"/>
+          <w:b w:val="0"/>
+          <w:bCs w:val="0"/>
           <w:sz w:val="24"/>
           <w:szCs w:val="24"/>
         </w:rPr>
-        <w:t>flatMap</w:t>
-      </w:r>
-      <w:proofErr w:type="spellEnd"/>
-      <w:r>
-        <w:rPr>
-          <w:rStyle w:val="HTMLCode"/>
+      </w:pPr>
+      <w:r>
+        <w:rPr>
           <w:rFonts w:ascii="Times New Roman" w:hAnsi="Times New Roman" w:cs="Times New Roman"/>
           <w:sz w:val="24"/>
           <w:szCs w:val="24"/>
         </w:rPr>
-        <w:t>(</w:t>
-      </w:r>
-      <w:proofErr w:type="gramEnd"/>
-      <w:r>
-        <w:rPr>
-          <w:rStyle w:val="HTMLCode"/>
-          <w:rFonts w:ascii="Times New Roman" w:hAnsi="Times New Roman" w:cs="Times New Roman"/>
+        <w:t xml:space="preserve">The Spark Driver is the main coordinator of a Spark application. When we run a PySpark program, the Driver is responsible for understanding the instructions in our program and coordinating the work that needs to be done. It creates the Spark application and communicates with the executors to get the work completed. In simple terms, </w:t>
+      </w:r>
+      <w:r>
+        <w:rPr>
+          <w:rStyle w:val="Strong"/>
+          <w:rFonts w:ascii="Times New Roman" w:hAnsi="Times New Roman" w:cs="Times New Roman"/>
+          <w:b w:val="0"/>
+          <w:bCs w:val="0"/>
           <w:sz w:val="24"/>
           <w:szCs w:val="24"/>
         </w:rPr>
-        <w:t>)</w:t>
-      </w:r>
-      <w:r>
-        <w:t xml:space="preserve"> can split each sentence into individual words and produce </w:t>
-      </w:r>
-      <w:r>
-        <w:rPr>
-          <w:rStyle w:val="text-token-text-primary"/>
-        </w:rPr>
-        <w:t>["Hello", "</w:t>
-      </w:r>
-      <w:proofErr w:type="gramStart"/>
-      <w:r>
-        <w:rPr>
-          <w:rStyle w:val="text-token-text-primary"/>
-        </w:rPr>
-        <w:t>World</w:t>
-      </w:r>
-      <w:proofErr w:type="gramEnd"/>
-      <w:r>
-        <w:rPr>
-          <w:rStyle w:val="text-token-text-primary"/>
-        </w:rPr>
-        <w:t>", "Hello", "Spark"]</w:t>
-      </w:r>
-      <w:r>
-        <w:t xml:space="preserve">. In simple terms, </w:t>
-      </w:r>
-      <w:proofErr w:type="spellStart"/>
-      <w:proofErr w:type="gramStart"/>
-      <w:r>
-        <w:rPr>
-          <w:rStyle w:val="HTMLCode"/>
-          <w:rFonts w:ascii="Times New Roman" w:hAnsi="Times New Roman" w:cs="Times New Roman"/>
+        <w:t>the Driver is like the coordinator or manager of the Spark application.</w:t>
+      </w:r>
+    </w:p>
+    <w:p>
+      <w:pPr>
+        <w:rPr>
+          <w:rStyle w:val="Strong"/>
+          <w:rFonts w:ascii="Times New Roman" w:hAnsi="Times New Roman" w:cs="Times New Roman"/>
+          <w:b w:val="0"/>
+          <w:bCs w:val="0"/>
           <w:sz w:val="24"/>
           <w:szCs w:val="24"/>
         </w:rPr>
-        <w:t>flatMap</w:t>
-      </w:r>
-      <w:proofErr w:type="spellEnd"/>
-      <w:r>
-        <w:rPr>
-          <w:rStyle w:val="HTMLCode"/>
+      </w:pPr>
+    </w:p>
+    <w:p>
+      <w:pPr>
+        <w:rPr>
           <w:rFonts w:ascii="Times New Roman" w:hAnsi="Times New Roman" w:cs="Times New Roman"/>
           <w:sz w:val="24"/>
           <w:szCs w:val="24"/>
         </w:rPr>
-        <w:t>(</w:t>
-      </w:r>
-      <w:proofErr w:type="gramEnd"/>
-      <w:r>
-        <w:rPr>
-          <w:rStyle w:val="HTMLCode"/>
-          <w:rFonts w:ascii="Times New Roman" w:hAnsi="Times New Roman" w:cs="Times New Roman"/>
+      </w:pPr>
+      <w:r>
+        <w:rPr>
+          <w:rStyle w:val="Strong"/>
+          <w:rFonts w:ascii="Times New Roman" w:hAnsi="Times New Roman" w:cs="Times New Roman"/>
+          <w:b w:val="0"/>
+          <w:bCs w:val="0"/>
           <w:sz w:val="24"/>
           <w:szCs w:val="24"/>
         </w:rPr>
-        <w:t>)</w:t>
-      </w:r>
-      <w:r>
-        <w:t xml:space="preserve"> can follow a </w:t>
-      </w:r>
-      <w:r>
-        <w:rPr>
-          <w:rStyle w:val="Strong"/>
-          <w:b w:val="0"/>
-          <w:bCs w:val="0"/>
-        </w:rPr>
-        <w:t>one input to multiple outputs</w:t>
-      </w:r>
-      <w:r>
-        <w:t xml:space="preserve"> approach.</w:t>
-      </w:r>
-    </w:p>
-    <w:p>
-      <w:pPr>
-        <w:rPr>
-          <w:rFonts w:ascii="Times New Roman" w:hAnsi="Times New Roman" w:cs="Times New Roman"/>
-        </w:rPr>
-      </w:pPr>
-      <w:r>
-        <w:rPr>
-          <w:rFonts w:ascii="Times New Roman" w:hAnsi="Times New Roman" w:cs="Times New Roman"/>
-        </w:rPr>
-        <w:t xml:space="preserve">Q2. What is the difference between RDD and </w:t>
-      </w:r>
-      <w:proofErr w:type="spellStart"/>
-      <w:r>
-        <w:rPr>
-          <w:rFonts w:ascii="Times New Roman" w:hAnsi="Times New Roman" w:cs="Times New Roman"/>
-        </w:rPr>
-        <w:t>DataFrame</w:t>
-      </w:r>
-      <w:proofErr w:type="spellEnd"/>
-      <w:r>
-        <w:rPr>
-          <w:rFonts w:ascii="Times New Roman" w:hAnsi="Times New Roman" w:cs="Times New Roman"/>
-        </w:rPr>
-        <w:t xml:space="preserve">. </w:t>
+        <w:t xml:space="preserve">What is Execution mode ? </w:t>
+      </w:r>
+    </w:p>
+    <w:p>
+      <w:pPr>
+        <w:pStyle w:val="isselectedend"/>
+      </w:pPr>
+      <w:r>
+        <w:t xml:space="preserve">Execution mode describes where the Spark Driver runs. Spark commonly has local, client, and cluster execution modes. In local mode, the Spark application runs on our own computer, which is commonly used when learning or testing PySpark. In client mode, the Driver runs on the machine from which the application was submitted. In cluster mode, the Driver runs inside the cluster. In simple terms, </w:t>
+      </w:r>
+      <w:r>
+        <w:rPr>
+          <w:rStyle w:val="Strong"/>
+          <w:b w:val="0"/>
+          <w:bCs w:val="0"/>
+        </w:rPr>
+        <w:t>execution mode tells us where the Driver and application are running.</w:t>
+      </w:r>
+    </w:p>
+    <w:p>
+      <w:pPr>
+        <w:pStyle w:val="isselectedend"/>
+      </w:pPr>
+      <w:r>
+        <w:t>What is Spark Executor ?</w:t>
+      </w:r>
+    </w:p>
+    <w:p>
+      <w:pPr>
+        <w:pStyle w:val="isselectedend"/>
+      </w:pPr>
+      <w:r>
+        <w:t xml:space="preserve">A Spark Executor is a process that runs on a worker node and performs the actual work assigned by the Driver. The Driver sends tasks to the executors, and the executors process the data. Executors can also keep data in memory or on disk when Spark needs it during processing. In simple terms, </w:t>
+      </w:r>
+      <w:r>
+        <w:rPr>
+          <w:rStyle w:val="Strong"/>
+          <w:b w:val="0"/>
+          <w:bCs w:val="0"/>
+        </w:rPr>
+        <w:t>the Driver coordinates the work, while executors perform the work.</w:t>
+      </w:r>
+    </w:p>
+    <w:p>
+      <w:pPr>
+        <w:pStyle w:val="isselectedend"/>
+      </w:pPr>
+      <w:r>
+        <w:t>What is Task ?</w:t>
+      </w:r>
+    </w:p>
+    <w:p>
+      <w:pPr>
+        <w:pStyle w:val="isselectedend"/>
+      </w:pPr>
+      <w:r>
+        <w:t xml:space="preserve">A task is a small unit of work that Spark sends to an executor. Spark divides data into partitions, and tasks are created to process those partitions. For example, if a stage has four partitions, Spark can create four tasks to process them. In simple terms, </w:t>
+      </w:r>
+      <w:r>
+        <w:rPr>
+          <w:rStyle w:val="Strong"/>
+          <w:b w:val="0"/>
+          <w:bCs w:val="0"/>
+        </w:rPr>
+        <w:t>a task is one individual piece of work that an executor performs.</w:t>
+      </w:r>
+    </w:p>
+    <w:p>
+      <w:pPr>
+        <w:pStyle w:val="isselectedend"/>
+      </w:pPr>
+    </w:p>
+    <w:p>
+      <w:pPr>
+        <w:pStyle w:val="isselectedend"/>
+      </w:pPr>
+      <w:r>
+        <w:t>What is a Stage ?</w:t>
+      </w:r>
+    </w:p>
+    <w:p>
+      <w:pPr>
+        <w:pStyle w:val="isselectedend"/>
+      </w:pPr>
+      <w:r>
+        <w:t xml:space="preserve">A stage is a group of tasks that Spark can execute as part of a particular part of a job. Spark divides a job into different stages, especially when operations require data to be shuffled between partitions. Each stage contains multiple tasks that work on different partitions of the data. In simple terms, </w:t>
+      </w:r>
+      <w:r>
+        <w:rPr>
+          <w:rStyle w:val="Strong"/>
+          <w:b w:val="0"/>
+          <w:bCs w:val="0"/>
+        </w:rPr>
+        <w:t>a stage is one section of a Spark job containing multiple tasks.</w:t>
+      </w:r>
+    </w:p>
+    <w:p>
+      <w:pPr>
+        <w:pStyle w:val="isselectedend"/>
+      </w:pPr>
+      <w:r>
+        <w:t>What is a Worker Node ?</w:t>
+      </w:r>
+    </w:p>
+    <w:p>
+      <w:pPr>
+        <w:pStyle w:val="isselectedend"/>
+        <w:rPr>
+          <w:rStyle w:val="Strong"/>
+          <w:b w:val="0"/>
+          <w:bCs w:val="0"/>
+        </w:rPr>
+      </w:pPr>
+      <w:r>
+        <w:t xml:space="preserve">A worker node is a machine in a Spark cluster that provides resources for running Spark applications. Executors run on worker nodes and perform the tasks given to them by the Driver. A Spark cluster can have multiple worker nodes, allowing Spark to distribute processing across different machines. In simple terms, </w:t>
+      </w:r>
+      <w:r>
+        <w:rPr>
+          <w:rStyle w:val="Strong"/>
+          <w:b w:val="0"/>
+          <w:bCs w:val="0"/>
+        </w:rPr>
+        <w:t>a worker node is a machine that provides the resources where Spark executors do their work.</w:t>
+      </w:r>
+    </w:p>
+    <w:p>
+      <w:pPr>
+        <w:pStyle w:val="isselectedend"/>
+      </w:pPr>
+      <w:r>
+        <w:rPr>
+          <w:rStyle w:val="Strong"/>
+          <w:b w:val="0"/>
+          <w:bCs w:val="0"/>
+        </w:rPr>
+        <w:t>How Everything Works together</w:t>
+      </w:r>
+    </w:p>
+    <w:p>
+      <w:pPr>
+        <w:pStyle w:val="NormalWeb"/>
+      </w:pPr>
+      <w:r>
+        <w:t xml:space="preserve">When a PySpark application starts, the </w:t>
+      </w:r>
+      <w:r>
+        <w:rPr>
+          <w:rStyle w:val="Strong"/>
+          <w:b w:val="0"/>
+          <w:bCs w:val="0"/>
+        </w:rPr>
+        <w:t>Driver</w:t>
+      </w:r>
+      <w:r>
+        <w:t xml:space="preserve"> coordinates the application. The Driver creates </w:t>
+      </w:r>
+      <w:r>
+        <w:rPr>
+          <w:rStyle w:val="Strong"/>
+          <w:b w:val="0"/>
+          <w:bCs w:val="0"/>
+        </w:rPr>
+        <w:t>jobs</w:t>
+      </w:r>
+      <w:r>
+        <w:t xml:space="preserve">, and each job can be divided into different </w:t>
+      </w:r>
+      <w:r>
+        <w:rPr>
+          <w:rStyle w:val="Strong"/>
+          <w:b w:val="0"/>
+          <w:bCs w:val="0"/>
+        </w:rPr>
+        <w:t>stages</w:t>
+      </w:r>
+      <w:r>
+        <w:t xml:space="preserve">. Each stage contains multiple </w:t>
+      </w:r>
+      <w:r>
+        <w:rPr>
+          <w:rStyle w:val="Strong"/>
+          <w:b w:val="0"/>
+          <w:bCs w:val="0"/>
+        </w:rPr>
+        <w:t>tasks</w:t>
+      </w:r>
+      <w:r>
+        <w:t xml:space="preserve">. These tasks are sent to </w:t>
+      </w:r>
+      <w:r>
+        <w:rPr>
+          <w:rStyle w:val="Strong"/>
+          <w:b w:val="0"/>
+          <w:bCs w:val="0"/>
+        </w:rPr>
+        <w:t>executors</w:t>
+      </w:r>
+      <w:r>
+        <w:t xml:space="preserve">, which run on </w:t>
+      </w:r>
+      <w:r>
+        <w:rPr>
+          <w:rStyle w:val="Strong"/>
+          <w:b w:val="0"/>
+          <w:bCs w:val="0"/>
+        </w:rPr>
+        <w:t>worker nodes</w:t>
+      </w:r>
+      <w:r>
+        <w:t xml:space="preserve">. The data itself is divided into </w:t>
+      </w:r>
+      <w:r>
+        <w:rPr>
+          <w:rStyle w:val="Strong"/>
+          <w:b w:val="0"/>
+          <w:bCs w:val="0"/>
+        </w:rPr>
+        <w:t>partitions</w:t>
+      </w:r>
+      <w:r>
+        <w:t>, allowing multiple tasks to process different pieces of data at the same time. This is how Spark achieves distributed and parallel processing.</w:t>
       </w:r>
     </w:p>
     <w:p>
@@ -629,658 +924,34 @@
           <w:szCs w:val="24"/>
         </w:rPr>
       </w:pPr>
-      <w:r>
-        <w:rPr>
-          <w:rFonts w:ascii="Times New Roman" w:hAnsi="Times New Roman" w:cs="Times New Roman"/>
-          <w:sz w:val="24"/>
-          <w:szCs w:val="24"/>
-        </w:rPr>
-        <w:t xml:space="preserve">An RDD, or Resilient Distributed Dataset, is a basic Spark data structure that represents a distributed collection of objects. Spark can divide the data into partitions and process those partitions in parallel. RDDs give developers more low-level control over how the data is processed, but they do not provide the same structured format as a </w:t>
-      </w:r>
-      <w:proofErr w:type="spellStart"/>
-      <w:r>
-        <w:rPr>
-          <w:rFonts w:ascii="Times New Roman" w:hAnsi="Times New Roman" w:cs="Times New Roman"/>
-          <w:sz w:val="24"/>
-          <w:szCs w:val="24"/>
-        </w:rPr>
-        <w:t>DataFrame</w:t>
-      </w:r>
-      <w:proofErr w:type="spellEnd"/>
-      <w:r>
-        <w:rPr>
-          <w:rFonts w:ascii="Times New Roman" w:hAnsi="Times New Roman" w:cs="Times New Roman"/>
-          <w:sz w:val="24"/>
-          <w:szCs w:val="24"/>
-        </w:rPr>
-        <w:t>.</w:t>
-      </w:r>
-    </w:p>
-    <w:p>
-      <w:pPr>
-        <w:pStyle w:val="isselectedend"/>
-        <w:rPr>
-          <w:rStyle w:val="Strong"/>
-          <w:b w:val="0"/>
-          <w:bCs w:val="0"/>
-        </w:rPr>
-      </w:pPr>
-      <w:r>
-        <w:t xml:space="preserve">A </w:t>
-      </w:r>
-      <w:proofErr w:type="spellStart"/>
-      <w:r>
-        <w:t>DataFrame</w:t>
-      </w:r>
-      <w:proofErr w:type="spellEnd"/>
-      <w:r>
-        <w:t xml:space="preserve"> is a higher-level Spark data structure that organizes data into rows and columns, </w:t>
-      </w:r>
-      <w:proofErr w:type="gramStart"/>
-      <w:r>
-        <w:t>similar to</w:t>
-      </w:r>
-      <w:proofErr w:type="gramEnd"/>
-      <w:r>
-        <w:t xml:space="preserve"> a table in a database. It also has a </w:t>
-      </w:r>
-      <w:proofErr w:type="gramStart"/>
-      <w:r>
-        <w:t>schema</w:t>
-      </w:r>
-      <w:proofErr w:type="gramEnd"/>
-      <w:r>
-        <w:t xml:space="preserve"> that tells Spark the names and data types of the columns. </w:t>
-      </w:r>
-      <w:proofErr w:type="spellStart"/>
-      <w:r>
-        <w:t>DataFrames</w:t>
-      </w:r>
-      <w:proofErr w:type="spellEnd"/>
-      <w:r>
-        <w:t xml:space="preserve"> are generally easier to work with for structured data and allow Spark to optimize many operations automatically. In simple terms, </w:t>
-      </w:r>
-      <w:r>
-        <w:rPr>
-          <w:rStyle w:val="Strong"/>
-          <w:b w:val="0"/>
-          <w:bCs w:val="0"/>
-        </w:rPr>
-        <w:t xml:space="preserve">an RDD is a distributed collection of objects, while a </w:t>
-      </w:r>
-      <w:proofErr w:type="spellStart"/>
-      <w:r>
-        <w:rPr>
-          <w:rStyle w:val="Strong"/>
-          <w:b w:val="0"/>
-          <w:bCs w:val="0"/>
-        </w:rPr>
-        <w:t>DataFrame</w:t>
-      </w:r>
-      <w:proofErr w:type="spellEnd"/>
-      <w:r>
-        <w:rPr>
-          <w:rStyle w:val="Strong"/>
-          <w:b w:val="0"/>
-          <w:bCs w:val="0"/>
-        </w:rPr>
-        <w:t xml:space="preserve"> is distributed data organized into rows and columns with a defined structure.</w:t>
-      </w:r>
-    </w:p>
-    <w:p>
-      <w:pPr>
-        <w:pStyle w:val="isselectedend"/>
-        <w:rPr>
-          <w:rStyle w:val="Strong"/>
-          <w:b w:val="0"/>
-          <w:bCs w:val="0"/>
-        </w:rPr>
-      </w:pPr>
-    </w:p>
-    <w:p>
-      <w:pPr>
-        <w:pStyle w:val="isselectedend"/>
-        <w:rPr>
-          <w:rStyle w:val="Strong"/>
-          <w:b w:val="0"/>
-          <w:bCs w:val="0"/>
-        </w:rPr>
-      </w:pPr>
-    </w:p>
-    <w:p>
-      <w:pPr>
-        <w:pStyle w:val="isselectedend"/>
-      </w:pPr>
-    </w:p>
-    <w:p>
-      <w:pPr>
-        <w:rPr>
-          <w:rFonts w:ascii="Times New Roman" w:hAnsi="Times New Roman" w:cs="Times New Roman"/>
-        </w:rPr>
-      </w:pPr>
-      <w:r>
-        <w:rPr>
-          <w:rFonts w:ascii="Times New Roman" w:hAnsi="Times New Roman" w:cs="Times New Roman"/>
-        </w:rPr>
-        <w:lastRenderedPageBreak/>
-        <w:t xml:space="preserve">Q3. How to control the parallelism in spark. </w:t>
-      </w:r>
-    </w:p>
-    <w:p>
-      <w:pPr>
-        <w:pStyle w:val="isselectedend"/>
-        <w:rPr>
-          <w:rStyle w:val="Strong"/>
-          <w:b w:val="0"/>
-          <w:bCs w:val="0"/>
-        </w:rPr>
-      </w:pPr>
-      <w:r>
-        <w:t xml:space="preserve">Parallelism in Spark refers to how much work Spark can perform at the same time. One of the main ways to control parallelism is by controlling the number of partitions. A partition is basically a chunk of data that Spark can process separately. For example, when creating an RDD, we can specify the number of partitions using </w:t>
-      </w:r>
-      <w:proofErr w:type="gramStart"/>
-      <w:r>
-        <w:rPr>
-          <w:rStyle w:val="HTMLCode"/>
-          <w:rFonts w:ascii="Times New Roman" w:hAnsi="Times New Roman" w:cs="Times New Roman"/>
-          <w:sz w:val="24"/>
-          <w:szCs w:val="24"/>
-        </w:rPr>
-        <w:t>parallelize(</w:t>
-      </w:r>
-      <w:proofErr w:type="gramEnd"/>
-      <w:r>
-        <w:rPr>
-          <w:rStyle w:val="HTMLCode"/>
-          <w:rFonts w:ascii="Times New Roman" w:hAnsi="Times New Roman" w:cs="Times New Roman"/>
-          <w:sz w:val="24"/>
-          <w:szCs w:val="24"/>
-        </w:rPr>
-        <w:t>data, 4)</w:t>
-      </w:r>
-      <w:r>
-        <w:t xml:space="preserve">. We can also change the number of partitions using functions such as </w:t>
-      </w:r>
-      <w:proofErr w:type="gramStart"/>
-      <w:r>
-        <w:rPr>
-          <w:rStyle w:val="HTMLCode"/>
-          <w:rFonts w:ascii="Times New Roman" w:hAnsi="Times New Roman" w:cs="Times New Roman"/>
-          <w:sz w:val="24"/>
-          <w:szCs w:val="24"/>
-        </w:rPr>
-        <w:t>repartition(</w:t>
-      </w:r>
-      <w:proofErr w:type="gramEnd"/>
-      <w:r>
-        <w:rPr>
-          <w:rStyle w:val="HTMLCode"/>
-          <w:rFonts w:ascii="Times New Roman" w:hAnsi="Times New Roman" w:cs="Times New Roman"/>
-          <w:sz w:val="24"/>
-          <w:szCs w:val="24"/>
-        </w:rPr>
-        <w:t>)</w:t>
-      </w:r>
-      <w:r>
-        <w:t xml:space="preserve"> and </w:t>
-      </w:r>
-      <w:proofErr w:type="gramStart"/>
-      <w:r>
-        <w:rPr>
-          <w:rStyle w:val="HTMLCode"/>
-          <w:rFonts w:ascii="Times New Roman" w:hAnsi="Times New Roman" w:cs="Times New Roman"/>
-          <w:sz w:val="24"/>
-          <w:szCs w:val="24"/>
-        </w:rPr>
-        <w:t>coalesce(</w:t>
-      </w:r>
-      <w:proofErr w:type="gramEnd"/>
-      <w:r>
-        <w:rPr>
-          <w:rStyle w:val="HTMLCode"/>
-          <w:rFonts w:ascii="Times New Roman" w:hAnsi="Times New Roman" w:cs="Times New Roman"/>
-          <w:sz w:val="24"/>
-          <w:szCs w:val="24"/>
-        </w:rPr>
-        <w:t>)</w:t>
-      </w:r>
-      <w:r>
-        <w:t xml:space="preserve">. In simple terms, </w:t>
-      </w:r>
-      <w:r>
-        <w:rPr>
-          <w:rStyle w:val="Strong"/>
-          <w:b w:val="0"/>
-          <w:bCs w:val="0"/>
-        </w:rPr>
-        <w:t>more partitions can allow more work to happen in parallel, depending on the available resources.</w:t>
-      </w:r>
-    </w:p>
-    <w:p>
-      <w:pPr>
-        <w:pStyle w:val="isselectedend"/>
-      </w:pPr>
-      <w:r>
-        <w:t xml:space="preserve"> </w:t>
-      </w:r>
-    </w:p>
-    <w:p>
-      <w:pPr>
-        <w:rPr>
-          <w:rFonts w:ascii="Times New Roman" w:hAnsi="Times New Roman" w:cs="Times New Roman"/>
-        </w:rPr>
-      </w:pPr>
-    </w:p>
-    <w:p>
-      <w:pPr>
-        <w:rPr>
-          <w:rFonts w:ascii="Times New Roman" w:hAnsi="Times New Roman" w:cs="Times New Roman"/>
-        </w:rPr>
-      </w:pPr>
-      <w:r>
-        <w:rPr>
-          <w:rFonts w:ascii="Times New Roman" w:hAnsi="Times New Roman" w:cs="Times New Roman"/>
-        </w:rPr>
-        <w:t>Q4. Please explain followings</w:t>
-      </w:r>
-    </w:p>
-    <w:p>
-      <w:pPr>
-        <w:rPr>
-          <w:rFonts w:ascii="Times New Roman" w:hAnsi="Times New Roman" w:cs="Times New Roman"/>
-        </w:rPr>
-      </w:pPr>
-    </w:p>
-    <w:p>
-      <w:pPr>
-        <w:rPr>
-          <w:rFonts w:ascii="Times New Roman" w:hAnsi="Times New Roman" w:cs="Times New Roman"/>
-        </w:rPr>
-      </w:pPr>
-      <w:r>
-        <w:rPr>
-          <w:rFonts w:ascii="Times New Roman" w:hAnsi="Times New Roman" w:cs="Times New Roman"/>
-        </w:rPr>
-        <w:t>Spark Driver</w:t>
-      </w:r>
-    </w:p>
-    <w:p>
-      <w:pPr>
-        <w:rPr>
-          <w:rFonts w:ascii="Times New Roman" w:hAnsi="Times New Roman" w:cs="Times New Roman"/>
-        </w:rPr>
-      </w:pPr>
-    </w:p>
-    <w:p>
-      <w:pPr>
-        <w:rPr>
-          <w:rStyle w:val="Strong"/>
-          <w:rFonts w:ascii="Times New Roman" w:hAnsi="Times New Roman" w:cs="Times New Roman"/>
-          <w:b w:val="0"/>
-          <w:bCs w:val="0"/>
-          <w:sz w:val="24"/>
-          <w:szCs w:val="24"/>
-        </w:rPr>
-      </w:pPr>
-      <w:r>
-        <w:rPr>
-          <w:rFonts w:ascii="Times New Roman" w:hAnsi="Times New Roman" w:cs="Times New Roman"/>
-          <w:sz w:val="24"/>
-          <w:szCs w:val="24"/>
-        </w:rPr>
-        <w:t xml:space="preserve">The Spark Driver is the main coordinator of a Spark application. When we run a </w:t>
-      </w:r>
-      <w:proofErr w:type="spellStart"/>
-      <w:r>
-        <w:rPr>
-          <w:rFonts w:ascii="Times New Roman" w:hAnsi="Times New Roman" w:cs="Times New Roman"/>
-          <w:sz w:val="24"/>
-          <w:szCs w:val="24"/>
-        </w:rPr>
-        <w:t>PySpark</w:t>
-      </w:r>
-      <w:proofErr w:type="spellEnd"/>
-      <w:r>
-        <w:rPr>
-          <w:rFonts w:ascii="Times New Roman" w:hAnsi="Times New Roman" w:cs="Times New Roman"/>
-          <w:sz w:val="24"/>
-          <w:szCs w:val="24"/>
-        </w:rPr>
-        <w:t xml:space="preserve"> program, the Driver is responsible for understanding the instructions in our program and coordinating the work that needs to be done. It creates the Spark application and communicates with the executors to get the work completed. In simple terms, </w:t>
-      </w:r>
-      <w:r>
-        <w:rPr>
-          <w:rStyle w:val="Strong"/>
-          <w:rFonts w:ascii="Times New Roman" w:hAnsi="Times New Roman" w:cs="Times New Roman"/>
-          <w:b w:val="0"/>
-          <w:bCs w:val="0"/>
-          <w:sz w:val="24"/>
-          <w:szCs w:val="24"/>
-        </w:rPr>
-        <w:t>the Driver is like the coordinator or manager of the Spark application.</w:t>
-      </w:r>
-    </w:p>
-    <w:p>
-      <w:pPr>
-        <w:rPr>
-          <w:rStyle w:val="Strong"/>
-          <w:rFonts w:ascii="Times New Roman" w:hAnsi="Times New Roman" w:cs="Times New Roman"/>
-          <w:b w:val="0"/>
-          <w:bCs w:val="0"/>
-          <w:sz w:val="24"/>
-          <w:szCs w:val="24"/>
-        </w:rPr>
-      </w:pPr>
-    </w:p>
-    <w:p>
-      <w:pPr>
-        <w:rPr>
-          <w:rFonts w:ascii="Times New Roman" w:hAnsi="Times New Roman" w:cs="Times New Roman"/>
-          <w:sz w:val="24"/>
-          <w:szCs w:val="24"/>
-        </w:rPr>
-      </w:pPr>
-      <w:r>
-        <w:rPr>
-          <w:rStyle w:val="Strong"/>
-          <w:rFonts w:ascii="Times New Roman" w:hAnsi="Times New Roman" w:cs="Times New Roman"/>
-          <w:b w:val="0"/>
-          <w:bCs w:val="0"/>
-          <w:sz w:val="24"/>
-          <w:szCs w:val="24"/>
-        </w:rPr>
-        <w:t xml:space="preserve">What is Execution </w:t>
-      </w:r>
-      <w:proofErr w:type="gramStart"/>
-      <w:r>
-        <w:rPr>
-          <w:rStyle w:val="Strong"/>
-          <w:rFonts w:ascii="Times New Roman" w:hAnsi="Times New Roman" w:cs="Times New Roman"/>
-          <w:b w:val="0"/>
-          <w:bCs w:val="0"/>
-          <w:sz w:val="24"/>
-          <w:szCs w:val="24"/>
-        </w:rPr>
-        <w:t>mode ?</w:t>
-      </w:r>
-      <w:proofErr w:type="gramEnd"/>
-      <w:r>
-        <w:rPr>
-          <w:rStyle w:val="Strong"/>
-          <w:rFonts w:ascii="Times New Roman" w:hAnsi="Times New Roman" w:cs="Times New Roman"/>
-          <w:b w:val="0"/>
-          <w:bCs w:val="0"/>
-          <w:sz w:val="24"/>
-          <w:szCs w:val="24"/>
-        </w:rPr>
-        <w:t xml:space="preserve"> </w:t>
-      </w:r>
-    </w:p>
-    <w:p>
-      <w:pPr>
-        <w:pStyle w:val="isselectedend"/>
-      </w:pPr>
-      <w:r>
-        <w:t xml:space="preserve">Execution mode describes where the Spark Driver runs. Spark commonly has local, client, and cluster execution modes. In local mode, the Spark application runs on our own computer, which is commonly used when learning or testing </w:t>
-      </w:r>
-      <w:proofErr w:type="spellStart"/>
-      <w:r>
-        <w:t>PySpark</w:t>
-      </w:r>
-      <w:proofErr w:type="spellEnd"/>
-      <w:r>
-        <w:t xml:space="preserve">. In client mode, the Driver runs on the machine from which the application was submitted. In cluster mode, the Driver runs inside the cluster. In simple terms, </w:t>
-      </w:r>
-      <w:r>
-        <w:rPr>
-          <w:rStyle w:val="Strong"/>
-          <w:b w:val="0"/>
-          <w:bCs w:val="0"/>
-        </w:rPr>
-        <w:t>execution mode tells us where the Driver and application are running.</w:t>
-      </w:r>
-    </w:p>
-    <w:p>
-      <w:pPr>
-        <w:pStyle w:val="isselectedend"/>
-      </w:pPr>
-      <w:r>
-        <w:t xml:space="preserve">What is Spark </w:t>
-      </w:r>
-      <w:proofErr w:type="gramStart"/>
-      <w:r>
-        <w:t>Executor ?</w:t>
-      </w:r>
-      <w:proofErr w:type="gramEnd"/>
-    </w:p>
-    <w:p>
-      <w:pPr>
-        <w:pStyle w:val="isselectedend"/>
-      </w:pPr>
-      <w:r>
-        <w:t xml:space="preserve">A Spark Executor is a process that runs on a worker node and performs the actual work assigned by the Driver. The Driver sends tasks to the executors, and the executors process the data. Executors can also keep data in memory or on disk when Spark needs it during processing. In simple terms, </w:t>
-      </w:r>
-      <w:r>
-        <w:rPr>
-          <w:rStyle w:val="Strong"/>
-          <w:b w:val="0"/>
-          <w:bCs w:val="0"/>
-        </w:rPr>
-        <w:t>the Driver coordinates the work, while executors perform the work.</w:t>
-      </w:r>
-    </w:p>
-    <w:p>
-      <w:pPr>
-        <w:pStyle w:val="isselectedend"/>
-      </w:pPr>
-      <w:r>
-        <w:t xml:space="preserve">What is </w:t>
-      </w:r>
-      <w:proofErr w:type="gramStart"/>
-      <w:r>
-        <w:t>Task ?</w:t>
-      </w:r>
-      <w:proofErr w:type="gramEnd"/>
-    </w:p>
-    <w:p>
-      <w:pPr>
-        <w:pStyle w:val="isselectedend"/>
-      </w:pPr>
-      <w:r>
-        <w:t xml:space="preserve">A task is a small unit of work that Spark sends to an executor. Spark divides data into partitions, and tasks are created to process those partitions. For example, if a stage has four partitions, Spark can create four tasks to process them. In simple terms, </w:t>
-      </w:r>
-      <w:r>
-        <w:rPr>
-          <w:rStyle w:val="Strong"/>
-          <w:b w:val="0"/>
-          <w:bCs w:val="0"/>
-        </w:rPr>
-        <w:t>a task is one individual piece of work that an executor performs.</w:t>
-      </w:r>
-    </w:p>
-    <w:p>
-      <w:pPr>
-        <w:pStyle w:val="isselectedend"/>
-      </w:pPr>
-    </w:p>
-    <w:p>
-      <w:pPr>
-        <w:pStyle w:val="isselectedend"/>
-      </w:pPr>
-      <w:r>
-        <w:lastRenderedPageBreak/>
-        <w:t xml:space="preserve">What is a </w:t>
-      </w:r>
-      <w:proofErr w:type="gramStart"/>
-      <w:r>
-        <w:t>Stage ?</w:t>
-      </w:r>
-      <w:proofErr w:type="gramEnd"/>
-    </w:p>
-    <w:p>
-      <w:pPr>
-        <w:pStyle w:val="isselectedend"/>
-      </w:pPr>
-      <w:r>
-        <w:t xml:space="preserve">A stage is a group of tasks that Spark can execute as part of a particular part of a job. Spark divides a job into different stages, especially when operations require data to be shuffled between partitions. Each stage contains multiple tasks that work on different partitions of the data. In simple terms, </w:t>
-      </w:r>
-      <w:r>
-        <w:rPr>
-          <w:rStyle w:val="Strong"/>
-          <w:b w:val="0"/>
-          <w:bCs w:val="0"/>
-        </w:rPr>
-        <w:t>a stage is one section of a Spark job containing multiple tasks.</w:t>
-      </w:r>
-    </w:p>
-    <w:p>
-      <w:pPr>
-        <w:pStyle w:val="isselectedend"/>
-      </w:pPr>
-      <w:r>
-        <w:t xml:space="preserve">What is a Worker </w:t>
-      </w:r>
-      <w:proofErr w:type="gramStart"/>
-      <w:r>
-        <w:t>Node ?</w:t>
-      </w:r>
-      <w:proofErr w:type="gramEnd"/>
-    </w:p>
-    <w:p>
-      <w:pPr>
-        <w:pStyle w:val="isselectedend"/>
-        <w:rPr>
-          <w:rStyle w:val="Strong"/>
-          <w:b w:val="0"/>
-          <w:bCs w:val="0"/>
-        </w:rPr>
-      </w:pPr>
-      <w:r>
-        <w:t xml:space="preserve">A worker node is a machine in a Spark cluster that provides resources for running Spark applications. Executors run on worker nodes and perform the tasks given to them by the Driver. A Spark cluster can have multiple worker nodes, allowing Spark to distribute processing across different machines. In simple terms, </w:t>
-      </w:r>
-      <w:r>
-        <w:rPr>
-          <w:rStyle w:val="Strong"/>
-          <w:b w:val="0"/>
-          <w:bCs w:val="0"/>
-        </w:rPr>
-        <w:t>a worker node is a machine that provides the resources where Spark executors do their work.</w:t>
-      </w:r>
-    </w:p>
-    <w:p>
-      <w:pPr>
-        <w:pStyle w:val="isselectedend"/>
-      </w:pPr>
-      <w:r>
-        <w:rPr>
-          <w:rStyle w:val="Strong"/>
-          <w:b w:val="0"/>
-          <w:bCs w:val="0"/>
-        </w:rPr>
-        <w:t>How Everything Works together</w:t>
-      </w:r>
-    </w:p>
-    <w:p>
-      <w:pPr>
-        <w:pStyle w:val="NormalWeb"/>
-      </w:pPr>
-      <w:r>
-        <w:t xml:space="preserve">When a </w:t>
-      </w:r>
-      <w:proofErr w:type="spellStart"/>
-      <w:r>
-        <w:t>PySpark</w:t>
-      </w:r>
-      <w:proofErr w:type="spellEnd"/>
-      <w:r>
-        <w:t xml:space="preserve"> application starts, the </w:t>
-      </w:r>
-      <w:r>
-        <w:rPr>
-          <w:rStyle w:val="Strong"/>
-          <w:b w:val="0"/>
-          <w:bCs w:val="0"/>
-        </w:rPr>
-        <w:t>Driver</w:t>
-      </w:r>
-      <w:r>
-        <w:t xml:space="preserve"> coordinates the application. The Driver creates </w:t>
-      </w:r>
-      <w:r>
-        <w:rPr>
-          <w:rStyle w:val="Strong"/>
-          <w:b w:val="0"/>
-          <w:bCs w:val="0"/>
-        </w:rPr>
-        <w:t>jobs</w:t>
-      </w:r>
-      <w:r>
-        <w:t xml:space="preserve">, and each job can be divided into different </w:t>
-      </w:r>
-      <w:r>
-        <w:rPr>
-          <w:rStyle w:val="Strong"/>
-          <w:b w:val="0"/>
-          <w:bCs w:val="0"/>
-        </w:rPr>
-        <w:t>stages</w:t>
-      </w:r>
-      <w:r>
-        <w:t xml:space="preserve">. Each stage contains multiple </w:t>
-      </w:r>
-      <w:r>
-        <w:rPr>
-          <w:rStyle w:val="Strong"/>
-          <w:b w:val="0"/>
-          <w:bCs w:val="0"/>
-        </w:rPr>
-        <w:t>tasks</w:t>
-      </w:r>
-      <w:r>
-        <w:t xml:space="preserve">. These tasks are sent to </w:t>
-      </w:r>
-      <w:r>
-        <w:rPr>
-          <w:rStyle w:val="Strong"/>
-          <w:b w:val="0"/>
-          <w:bCs w:val="0"/>
-        </w:rPr>
-        <w:t>executors</w:t>
-      </w:r>
-      <w:r>
-        <w:t xml:space="preserve">, which run on </w:t>
-      </w:r>
-      <w:r>
-        <w:rPr>
-          <w:rStyle w:val="Strong"/>
-          <w:b w:val="0"/>
-          <w:bCs w:val="0"/>
-        </w:rPr>
-        <w:t>worker nodes</w:t>
-      </w:r>
-      <w:r>
-        <w:t xml:space="preserve">. The data itself is divided into </w:t>
-      </w:r>
-      <w:r>
-        <w:rPr>
-          <w:rStyle w:val="Strong"/>
-          <w:b w:val="0"/>
-          <w:bCs w:val="0"/>
-        </w:rPr>
-        <w:t>partitions</w:t>
-      </w:r>
-      <w:r>
-        <w:t>, allowing multiple tasks to process different pieces of data at the same time. This is how Spark achieves distributed and parallel processing.</w:t>
-      </w:r>
-    </w:p>
-    <w:p>
-      <w:pPr>
-        <w:rPr>
-          <w:rFonts w:ascii="Times New Roman" w:hAnsi="Times New Roman" w:cs="Times New Roman"/>
-          <w:sz w:val="24"/>
-          <w:szCs w:val="24"/>
-        </w:rPr>
-      </w:pPr>
+    </w:p>
+    <w:p>
+      <w:pPr>
+        <w:rPr>
+          <w:rFonts w:ascii="Times New Roman" w:hAnsi="Times New Roman" w:cs="Times New Roman"/>
+        </w:rPr>
+      </w:pPr>
+      <w:r>
+        <w:rPr>
+          <w:rFonts w:ascii="Times New Roman" w:hAnsi="Times New Roman" w:cs="Times New Roman"/>
+        </w:rPr>
+        <w:t xml:space="preserve">Lazy Evaluation </w:t>
+      </w:r>
+    </w:p>
+    <w:p>
+      <w:pPr>
+        <w:rPr>
+          <w:rFonts w:ascii="Times New Roman" w:hAnsi="Times New Roman" w:cs="Times New Roman"/>
+          <w:lang w:val="en-US"/>
+        </w:rPr>
+      </w:pPr>
+      <w:r>
+        <w:rPr>
+          <w:rFonts w:ascii="Times New Roman" w:hAnsi="Times New Roman" w:cs="Times New Roman"/>
+          <w:lang w:val="en-US"/>
+        </w:rPr>
+        <w:t>Lazy evaluation means that PySpark does not run an operation as soon as we write it. Instead, Spark keeps track of the transformations we apply to the data and waits until we request a result using an action such as count(), show(), or collect(). At that point, Spark creates an execution plan and performs the required operations. This allows Spark to optimize the process and avoid doing unnecessary work. In simple terms, Spark waits to process the data until the result is actually needed.</w:t>
+      </w:r>
     </w:p>
     <w:p>
       <w:pPr>
@@ -1937,7 +1608,6 @@
   <w:style w:type="character" w:default="1" w:styleId="DefaultParagraphFont">
     <w:name w:val="Default Paragraph Font"/>
     <w:uiPriority w:val="1"/>
-    <w:semiHidden/>
     <w:unhideWhenUsed/>
   </w:style>
   <w:style w:type="table" w:default="1" w:styleId="TableNormal">

</xml_diff>